<commit_message>
v0.3.0: confidential document protection, file upload and drop checks, config file, installer, admin page, eval
</commit_message>
<xml_diff>
--- a/demo/company-docs/hr-compensation-bands-2027.docx
+++ b/demo/company-docs/hr-compensation-bands-2027.docx
@@ -3,26 +3,132 @@
 <w:document xmlns:wpc="http://schemas.microsoft.com/office/word/2010/wordprocessingCanvas" xmlns:mo="http://schemas.microsoft.com/office/mac/office/2008/main" xmlns:mc="http://schemas.openxmlformats.org/markup-compatibility/2006" xmlns:mv="urn:schemas-microsoft-com:mac:vml" xmlns:o="urn:schemas-microsoft-com:office:office" xmlns:r="http://schemas.openxmlformats.org/officeDocument/2006/relationships" xmlns:m="http://schemas.openxmlformats.org/officeDocument/2006/math" xmlns:v="urn:schemas-microsoft-com:vml" xmlns:wp14="http://schemas.microsoft.com/office/word/2010/wordprocessingDrawing" xmlns:wp="http://schemas.openxmlformats.org/drawingml/2006/wordprocessingDrawing" xmlns:w10="urn:schemas-microsoft-com:office:word" xmlns:w="http://schemas.openxmlformats.org/wordprocessingml/2006/main" xmlns:w14="http://schemas.microsoft.com/office/word/2010/wordml" xmlns:wpg="http://schemas.microsoft.com/office/word/2010/wordprocessingGroup" xmlns:wpi="http://schemas.microsoft.com/office/word/2010/wordprocessingInk" xmlns:wne="http://schemas.microsoft.com/office/word/2006/wordml" xmlns:wps="http://schemas.microsoft.com/office/word/2010/wordprocessingShape" mc:Ignorable="w14 wp14">
   <w:body>
     <w:p>
-      <w:r>
-        <w:rPr>
-          <w:b/>
-        </w:rPr>
-        <w:t>CONFIDENTIAL - Calloway Metrics</w:t>
-      </w:r>
-    </w:p>
-    <w:p>
       <w:pPr>
-        <w:pStyle w:val="Heading1"/>
+        <w:pStyle w:val="Title"/>
       </w:pPr>
       <w:r>
         <w:t>HR Compensation Bands 2027</w:t>
       </w:r>
     </w:p>
-    <w:p>
-      <w:r>
-        <w:t>Version v2.1 | Last updated Aug 29, 2026 | Owner: Priya Ramanathan (VP People) | Distribution: Comp Committee, People Partners | Change note: L4 band moved up after audit</w:t>
-      </w:r>
-    </w:p>
+    <w:tbl>
+      <w:tblPr>
+        <w:tblStyle w:val="LightGrid-Accent1"/>
+        <w:tblW w:type="auto" w:w="0"/>
+        <w:tblLook w:firstColumn="1" w:firstRow="1" w:lastColumn="0" w:lastRow="0" w:noHBand="0" w:noVBand="1" w:val="04A0"/>
+      </w:tblPr>
+      <w:tblGrid>
+        <w:gridCol w:w="1728"/>
+        <w:gridCol w:w="1728"/>
+        <w:gridCol w:w="1728"/>
+        <w:gridCol w:w="1728"/>
+        <w:gridCol w:w="1728"/>
+      </w:tblGrid>
+      <w:tr>
+        <w:tc>
+          <w:tcPr>
+            <w:tcW w:type="dxa" w:w="1728"/>
+          </w:tcPr>
+          <w:p>
+            <w:r>
+              <w:t>Version</w:t>
+            </w:r>
+          </w:p>
+        </w:tc>
+        <w:tc>
+          <w:tcPr>
+            <w:tcW w:type="dxa" w:w="1728"/>
+          </w:tcPr>
+          <w:p>
+            <w:r>
+              <w:t>Date</w:t>
+            </w:r>
+          </w:p>
+        </w:tc>
+        <w:tc>
+          <w:tcPr>
+            <w:tcW w:type="dxa" w:w="1728"/>
+          </w:tcPr>
+          <w:p>
+            <w:r>
+              <w:t>Owner</w:t>
+            </w:r>
+          </w:p>
+        </w:tc>
+        <w:tc>
+          <w:tcPr>
+            <w:tcW w:type="dxa" w:w="1728"/>
+          </w:tcPr>
+          <w:p>
+            <w:r>
+              <w:t>Distribution</w:t>
+            </w:r>
+          </w:p>
+        </w:tc>
+        <w:tc>
+          <w:tcPr>
+            <w:tcW w:type="dxa" w:w="1728"/>
+          </w:tcPr>
+          <w:p>
+            <w:r>
+              <w:t>Change</w:t>
+            </w:r>
+          </w:p>
+        </w:tc>
+      </w:tr>
+      <w:tr>
+        <w:tc>
+          <w:tcPr>
+            <w:tcW w:type="dxa" w:w="1728"/>
+          </w:tcPr>
+          <w:p>
+            <w:r>
+              <w:t>v2.1</w:t>
+            </w:r>
+          </w:p>
+        </w:tc>
+        <w:tc>
+          <w:tcPr>
+            <w:tcW w:type="dxa" w:w="1728"/>
+          </w:tcPr>
+          <w:p>
+            <w:r>
+              <w:t>Aug 29, 2026</w:t>
+            </w:r>
+          </w:p>
+        </w:tc>
+        <w:tc>
+          <w:tcPr>
+            <w:tcW w:type="dxa" w:w="1728"/>
+          </w:tcPr>
+          <w:p>
+            <w:r>
+              <w:t>Priya Ramanathan (VP People)</w:t>
+            </w:r>
+          </w:p>
+        </w:tc>
+        <w:tc>
+          <w:tcPr>
+            <w:tcW w:type="dxa" w:w="1728"/>
+          </w:tcPr>
+          <w:p>
+            <w:r>
+              <w:t>Comp Committee, People Partners</w:t>
+            </w:r>
+          </w:p>
+        </w:tc>
+        <w:tc>
+          <w:tcPr>
+            <w:tcW w:type="dxa" w:w="1728"/>
+          </w:tcPr>
+          <w:p>
+            <w:r>
+              <w:t>L4 band moved up after audit</w:t>
+            </w:r>
+          </w:p>
+        </w:tc>
+      </w:tr>
+    </w:tbl>
+    <w:p/>
     <w:p>
       <w:r>
         <w:t>CONFIDENTIAL. People Team. Approved by the Compensation Committee on August 29, 2026. This document defines salary bands, equity guidelines and bonus targets for all US based roles effective January 1, 2027. Managers may not share band ranges with candidates or employees.</w:t>
@@ -115,17 +221,1036 @@
       </w:r>
     </w:p>
     <w:p>
+      <w:pPr>
+        <w:pStyle w:val="Heading2"/>
+      </w:pPr>
+      <w:r>
+        <w:t>Full engineering ladder (base, USD, Tier 1)</w:t>
+      </w:r>
+    </w:p>
+    <w:tbl>
+      <w:tblPr>
+        <w:tblStyle w:val="LightGrid-Accent1"/>
+        <w:tblW w:type="auto" w:w="0"/>
+        <w:tblLook w:firstColumn="1" w:firstRow="1" w:lastColumn="0" w:lastRow="0" w:noHBand="0" w:noVBand="1" w:val="04A0"/>
+      </w:tblPr>
+      <w:tblGrid>
+        <w:gridCol w:w="1234"/>
+        <w:gridCol w:w="1234"/>
+        <w:gridCol w:w="1234"/>
+        <w:gridCol w:w="1234"/>
+        <w:gridCol w:w="1234"/>
+        <w:gridCol w:w="1234"/>
+        <w:gridCol w:w="1234"/>
+      </w:tblGrid>
+      <w:tr>
+        <w:tc>
+          <w:tcPr>
+            <w:tcW w:type="dxa" w:w="1234"/>
+          </w:tcPr>
+          <w:p>
+            <w:r>
+              <w:t>Level</w:t>
+            </w:r>
+          </w:p>
+        </w:tc>
+        <w:tc>
+          <w:tcPr>
+            <w:tcW w:type="dxa" w:w="1234"/>
+          </w:tcPr>
+          <w:p>
+            <w:r>
+              <w:t>Title</w:t>
+            </w:r>
+          </w:p>
+        </w:tc>
+        <w:tc>
+          <w:tcPr>
+            <w:tcW w:type="dxa" w:w="1234"/>
+          </w:tcPr>
+          <w:p>
+            <w:r>
+              <w:t>Min</w:t>
+            </w:r>
+          </w:p>
+        </w:tc>
+        <w:tc>
+          <w:tcPr>
+            <w:tcW w:type="dxa" w:w="1234"/>
+          </w:tcPr>
+          <w:p>
+            <w:r>
+              <w:t>Mid</w:t>
+            </w:r>
+          </w:p>
+        </w:tc>
+        <w:tc>
+          <w:tcPr>
+            <w:tcW w:type="dxa" w:w="1234"/>
+          </w:tcPr>
+          <w:p>
+            <w:r>
+              <w:t>Max</w:t>
+            </w:r>
+          </w:p>
+        </w:tc>
+        <w:tc>
+          <w:tcPr>
+            <w:tcW w:type="dxa" w:w="1234"/>
+          </w:tcPr>
+          <w:p>
+            <w:r>
+              <w:t>Equity (% FD)</w:t>
+            </w:r>
+          </w:p>
+        </w:tc>
+        <w:tc>
+          <w:tcPr>
+            <w:tcW w:type="dxa" w:w="1234"/>
+          </w:tcPr>
+          <w:p>
+            <w:r>
+              <w:t>Target bonus</w:t>
+            </w:r>
+          </w:p>
+        </w:tc>
+      </w:tr>
+      <w:tr>
+        <w:tc>
+          <w:tcPr>
+            <w:tcW w:type="dxa" w:w="1234"/>
+          </w:tcPr>
+          <w:p>
+            <w:r>
+              <w:t>L2</w:t>
+            </w:r>
+          </w:p>
+        </w:tc>
+        <w:tc>
+          <w:tcPr>
+            <w:tcW w:type="dxa" w:w="1234"/>
+          </w:tcPr>
+          <w:p>
+            <w:r>
+              <w:t>Software Engineer I</w:t>
+            </w:r>
+          </w:p>
+        </w:tc>
+        <w:tc>
+          <w:tcPr>
+            <w:tcW w:type="dxa" w:w="1234"/>
+          </w:tcPr>
+          <w:p>
+            <w:r>
+              <w:t>118,000</w:t>
+            </w:r>
+          </w:p>
+        </w:tc>
+        <w:tc>
+          <w:tcPr>
+            <w:tcW w:type="dxa" w:w="1234"/>
+          </w:tcPr>
+          <w:p>
+            <w:r>
+              <w:t>130,000</w:t>
+            </w:r>
+          </w:p>
+        </w:tc>
+        <w:tc>
+          <w:tcPr>
+            <w:tcW w:type="dxa" w:w="1234"/>
+          </w:tcPr>
+          <w:p>
+            <w:r>
+              <w:t>142,000</w:t>
+            </w:r>
+          </w:p>
+        </w:tc>
+        <w:tc>
+          <w:tcPr>
+            <w:tcW w:type="dxa" w:w="1234"/>
+          </w:tcPr>
+          <w:p>
+            <w:r>
+              <w:t>0.015</w:t>
+            </w:r>
+          </w:p>
+        </w:tc>
+        <w:tc>
+          <w:tcPr>
+            <w:tcW w:type="dxa" w:w="1234"/>
+          </w:tcPr>
+          <w:p>
+            <w:r>
+              <w:t>10%</w:t>
+            </w:r>
+          </w:p>
+        </w:tc>
+      </w:tr>
+      <w:tr>
+        <w:tc>
+          <w:tcPr>
+            <w:tcW w:type="dxa" w:w="1234"/>
+          </w:tcPr>
+          <w:p>
+            <w:r>
+              <w:t>L3</w:t>
+            </w:r>
+          </w:p>
+        </w:tc>
+        <w:tc>
+          <w:tcPr>
+            <w:tcW w:type="dxa" w:w="1234"/>
+          </w:tcPr>
+          <w:p>
+            <w:r>
+              <w:t>Software Engineer II</w:t>
+            </w:r>
+          </w:p>
+        </w:tc>
+        <w:tc>
+          <w:tcPr>
+            <w:tcW w:type="dxa" w:w="1234"/>
+          </w:tcPr>
+          <w:p>
+            <w:r>
+              <w:t>142,000</w:t>
+            </w:r>
+          </w:p>
+        </w:tc>
+        <w:tc>
+          <w:tcPr>
+            <w:tcW w:type="dxa" w:w="1234"/>
+          </w:tcPr>
+          <w:p>
+            <w:r>
+              <w:t>156,500</w:t>
+            </w:r>
+          </w:p>
+        </w:tc>
+        <w:tc>
+          <w:tcPr>
+            <w:tcW w:type="dxa" w:w="1234"/>
+          </w:tcPr>
+          <w:p>
+            <w:r>
+              <w:t>171,000</w:t>
+            </w:r>
+          </w:p>
+        </w:tc>
+        <w:tc>
+          <w:tcPr>
+            <w:tcW w:type="dxa" w:w="1234"/>
+          </w:tcPr>
+          <w:p>
+            <w:r>
+              <w:t>0.03</w:t>
+            </w:r>
+          </w:p>
+        </w:tc>
+        <w:tc>
+          <w:tcPr>
+            <w:tcW w:type="dxa" w:w="1234"/>
+          </w:tcPr>
+          <w:p>
+            <w:r>
+              <w:t>10%</w:t>
+            </w:r>
+          </w:p>
+        </w:tc>
+      </w:tr>
+      <w:tr>
+        <w:tc>
+          <w:tcPr>
+            <w:tcW w:type="dxa" w:w="1234"/>
+          </w:tcPr>
+          <w:p>
+            <w:r>
+              <w:t>L4</w:t>
+            </w:r>
+          </w:p>
+        </w:tc>
+        <w:tc>
+          <w:tcPr>
+            <w:tcW w:type="dxa" w:w="1234"/>
+          </w:tcPr>
+          <w:p>
+            <w:r>
+              <w:t>Senior Software Engineer</w:t>
+            </w:r>
+          </w:p>
+        </w:tc>
+        <w:tc>
+          <w:tcPr>
+            <w:tcW w:type="dxa" w:w="1234"/>
+          </w:tcPr>
+          <w:p>
+            <w:r>
+              <w:t>168,000</w:t>
+            </w:r>
+          </w:p>
+        </w:tc>
+        <w:tc>
+          <w:tcPr>
+            <w:tcW w:type="dxa" w:w="1234"/>
+          </w:tcPr>
+          <w:p>
+            <w:r>
+              <w:t>186,000</w:t>
+            </w:r>
+          </w:p>
+        </w:tc>
+        <w:tc>
+          <w:tcPr>
+            <w:tcW w:type="dxa" w:w="1234"/>
+          </w:tcPr>
+          <w:p>
+            <w:r>
+              <w:t>204,000</w:t>
+            </w:r>
+          </w:p>
+        </w:tc>
+        <w:tc>
+          <w:tcPr>
+            <w:tcW w:type="dxa" w:w="1234"/>
+          </w:tcPr>
+          <w:p>
+            <w:r>
+              <w:t>0.06</w:t>
+            </w:r>
+          </w:p>
+        </w:tc>
+        <w:tc>
+          <w:tcPr>
+            <w:tcW w:type="dxa" w:w="1234"/>
+          </w:tcPr>
+          <w:p>
+            <w:r>
+              <w:t>10%</w:t>
+            </w:r>
+          </w:p>
+        </w:tc>
+      </w:tr>
+      <w:tr>
+        <w:tc>
+          <w:tcPr>
+            <w:tcW w:type="dxa" w:w="1234"/>
+          </w:tcPr>
+          <w:p>
+            <w:r>
+              <w:t>L5</w:t>
+            </w:r>
+          </w:p>
+        </w:tc>
+        <w:tc>
+          <w:tcPr>
+            <w:tcW w:type="dxa" w:w="1234"/>
+          </w:tcPr>
+          <w:p>
+            <w:r>
+              <w:t>Staff Engineer</w:t>
+            </w:r>
+          </w:p>
+        </w:tc>
+        <w:tc>
+          <w:tcPr>
+            <w:tcW w:type="dxa" w:w="1234"/>
+          </w:tcPr>
+          <w:p>
+            <w:r>
+              <w:t>205,000</w:t>
+            </w:r>
+          </w:p>
+        </w:tc>
+        <w:tc>
+          <w:tcPr>
+            <w:tcW w:type="dxa" w:w="1234"/>
+          </w:tcPr>
+          <w:p>
+            <w:r>
+              <w:t>226,500</w:t>
+            </w:r>
+          </w:p>
+        </w:tc>
+        <w:tc>
+          <w:tcPr>
+            <w:tcW w:type="dxa" w:w="1234"/>
+          </w:tcPr>
+          <w:p>
+            <w:r>
+              <w:t>248,000</w:t>
+            </w:r>
+          </w:p>
+        </w:tc>
+        <w:tc>
+          <w:tcPr>
+            <w:tcW w:type="dxa" w:w="1234"/>
+          </w:tcPr>
+          <w:p>
+            <w:r>
+              <w:t>0.12</w:t>
+            </w:r>
+          </w:p>
+        </w:tc>
+        <w:tc>
+          <w:tcPr>
+            <w:tcW w:type="dxa" w:w="1234"/>
+          </w:tcPr>
+          <w:p>
+            <w:r>
+              <w:t>10%</w:t>
+            </w:r>
+          </w:p>
+        </w:tc>
+      </w:tr>
+      <w:tr>
+        <w:tc>
+          <w:tcPr>
+            <w:tcW w:type="dxa" w:w="1234"/>
+          </w:tcPr>
+          <w:p>
+            <w:r>
+              <w:t>L6</w:t>
+            </w:r>
+          </w:p>
+        </w:tc>
+        <w:tc>
+          <w:tcPr>
+            <w:tcW w:type="dxa" w:w="1234"/>
+          </w:tcPr>
+          <w:p>
+            <w:r>
+              <w:t>Principal Engineer</w:t>
+            </w:r>
+          </w:p>
+        </w:tc>
+        <w:tc>
+          <w:tcPr>
+            <w:tcW w:type="dxa" w:w="1234"/>
+          </w:tcPr>
+          <w:p>
+            <w:r>
+              <w:t>245,000</w:t>
+            </w:r>
+          </w:p>
+        </w:tc>
+        <w:tc>
+          <w:tcPr>
+            <w:tcW w:type="dxa" w:w="1234"/>
+          </w:tcPr>
+          <w:p>
+            <w:r>
+              <w:t>270,000</w:t>
+            </w:r>
+          </w:p>
+        </w:tc>
+        <w:tc>
+          <w:tcPr>
+            <w:tcW w:type="dxa" w:w="1234"/>
+          </w:tcPr>
+          <w:p>
+            <w:r>
+              <w:t>295,000</w:t>
+            </w:r>
+          </w:p>
+        </w:tc>
+        <w:tc>
+          <w:tcPr>
+            <w:tcW w:type="dxa" w:w="1234"/>
+          </w:tcPr>
+          <w:p>
+            <w:r>
+              <w:t>0.22</w:t>
+            </w:r>
+          </w:p>
+        </w:tc>
+        <w:tc>
+          <w:tcPr>
+            <w:tcW w:type="dxa" w:w="1234"/>
+          </w:tcPr>
+          <w:p>
+            <w:r>
+              <w:t>15%</w:t>
+            </w:r>
+          </w:p>
+        </w:tc>
+      </w:tr>
+      <w:tr>
+        <w:tc>
+          <w:tcPr>
+            <w:tcW w:type="dxa" w:w="1234"/>
+          </w:tcPr>
+          <w:p>
+            <w:r>
+              <w:t>M1</w:t>
+            </w:r>
+          </w:p>
+        </w:tc>
+        <w:tc>
+          <w:tcPr>
+            <w:tcW w:type="dxa" w:w="1234"/>
+          </w:tcPr>
+          <w:p>
+            <w:r>
+              <w:t>Engineering Manager</w:t>
+            </w:r>
+          </w:p>
+        </w:tc>
+        <w:tc>
+          <w:tcPr>
+            <w:tcW w:type="dxa" w:w="1234"/>
+          </w:tcPr>
+          <w:p>
+            <w:r>
+              <w:t>195,000</w:t>
+            </w:r>
+          </w:p>
+        </w:tc>
+        <w:tc>
+          <w:tcPr>
+            <w:tcW w:type="dxa" w:w="1234"/>
+          </w:tcPr>
+          <w:p>
+            <w:r>
+              <w:t>215,500</w:t>
+            </w:r>
+          </w:p>
+        </w:tc>
+        <w:tc>
+          <w:tcPr>
+            <w:tcW w:type="dxa" w:w="1234"/>
+          </w:tcPr>
+          <w:p>
+            <w:r>
+              <w:t>236,000</w:t>
+            </w:r>
+          </w:p>
+        </w:tc>
+        <w:tc>
+          <w:tcPr>
+            <w:tcW w:type="dxa" w:w="1234"/>
+          </w:tcPr>
+          <w:p>
+            <w:r>
+              <w:t>0.10</w:t>
+            </w:r>
+          </w:p>
+        </w:tc>
+        <w:tc>
+          <w:tcPr>
+            <w:tcW w:type="dxa" w:w="1234"/>
+          </w:tcPr>
+          <w:p>
+            <w:r>
+              <w:t>15%</w:t>
+            </w:r>
+          </w:p>
+        </w:tc>
+      </w:tr>
+      <w:tr>
+        <w:tc>
+          <w:tcPr>
+            <w:tcW w:type="dxa" w:w="1234"/>
+          </w:tcPr>
+          <w:p>
+            <w:r>
+              <w:t>M2</w:t>
+            </w:r>
+          </w:p>
+        </w:tc>
+        <w:tc>
+          <w:tcPr>
+            <w:tcW w:type="dxa" w:w="1234"/>
+          </w:tcPr>
+          <w:p>
+            <w:r>
+              <w:t>Senior Eng Manager</w:t>
+            </w:r>
+          </w:p>
+        </w:tc>
+        <w:tc>
+          <w:tcPr>
+            <w:tcW w:type="dxa" w:w="1234"/>
+          </w:tcPr>
+          <w:p>
+            <w:r>
+              <w:t>228,000</w:t>
+            </w:r>
+          </w:p>
+        </w:tc>
+        <w:tc>
+          <w:tcPr>
+            <w:tcW w:type="dxa" w:w="1234"/>
+          </w:tcPr>
+          <w:p>
+            <w:r>
+              <w:t>252,000</w:t>
+            </w:r>
+          </w:p>
+        </w:tc>
+        <w:tc>
+          <w:tcPr>
+            <w:tcW w:type="dxa" w:w="1234"/>
+          </w:tcPr>
+          <w:p>
+            <w:r>
+              <w:t>276,000</w:t>
+            </w:r>
+          </w:p>
+        </w:tc>
+        <w:tc>
+          <w:tcPr>
+            <w:tcW w:type="dxa" w:w="1234"/>
+          </w:tcPr>
+          <w:p>
+            <w:r>
+              <w:t>0.16</w:t>
+            </w:r>
+          </w:p>
+        </w:tc>
+        <w:tc>
+          <w:tcPr>
+            <w:tcW w:type="dxa" w:w="1234"/>
+          </w:tcPr>
+          <w:p>
+            <w:r>
+              <w:t>20%</w:t>
+            </w:r>
+          </w:p>
+        </w:tc>
+      </w:tr>
+      <w:tr>
+        <w:tc>
+          <w:tcPr>
+            <w:tcW w:type="dxa" w:w="1234"/>
+          </w:tcPr>
+          <w:p>
+            <w:r>
+              <w:t>D1</w:t>
+            </w:r>
+          </w:p>
+        </w:tc>
+        <w:tc>
+          <w:tcPr>
+            <w:tcW w:type="dxa" w:w="1234"/>
+          </w:tcPr>
+          <w:p>
+            <w:r>
+              <w:t>Director of Engineering</w:t>
+            </w:r>
+          </w:p>
+        </w:tc>
+        <w:tc>
+          <w:tcPr>
+            <w:tcW w:type="dxa" w:w="1234"/>
+          </w:tcPr>
+          <w:p>
+            <w:r>
+              <w:t>262,000</w:t>
+            </w:r>
+          </w:p>
+        </w:tc>
+        <w:tc>
+          <w:tcPr>
+            <w:tcW w:type="dxa" w:w="1234"/>
+          </w:tcPr>
+          <w:p>
+            <w:r>
+              <w:t>290,000</w:t>
+            </w:r>
+          </w:p>
+        </w:tc>
+        <w:tc>
+          <w:tcPr>
+            <w:tcW w:type="dxa" w:w="1234"/>
+          </w:tcPr>
+          <w:p>
+            <w:r>
+              <w:t>318,000</w:t>
+            </w:r>
+          </w:p>
+        </w:tc>
+        <w:tc>
+          <w:tcPr>
+            <w:tcW w:type="dxa" w:w="1234"/>
+          </w:tcPr>
+          <w:p>
+            <w:r>
+              <w:t>0.25</w:t>
+            </w:r>
+          </w:p>
+        </w:tc>
+        <w:tc>
+          <w:tcPr>
+            <w:tcW w:type="dxa" w:w="1234"/>
+          </w:tcPr>
+          <w:p>
+            <w:r>
+              <w:t>20%</w:t>
+            </w:r>
+          </w:p>
+        </w:tc>
+      </w:tr>
+    </w:tbl>
+    <w:p/>
+    <w:p>
+      <w:pPr>
+        <w:pStyle w:val="Heading2"/>
+      </w:pPr>
+      <w:r>
+        <w:t>Go to market (Tier 1)</w:t>
+      </w:r>
+    </w:p>
+    <w:tbl>
+      <w:tblPr>
+        <w:tblStyle w:val="LightGrid-Accent1"/>
+        <w:tblW w:type="auto" w:w="0"/>
+        <w:tblLook w:firstColumn="1" w:firstRow="1" w:lastColumn="0" w:lastRow="0" w:noHBand="0" w:noVBand="1" w:val="04A0"/>
+      </w:tblPr>
+      <w:tblGrid>
+        <w:gridCol w:w="1728"/>
+        <w:gridCol w:w="1728"/>
+        <w:gridCol w:w="1728"/>
+        <w:gridCol w:w="1728"/>
+        <w:gridCol w:w="1728"/>
+      </w:tblGrid>
+      <w:tr>
+        <w:tc>
+          <w:tcPr>
+            <w:tcW w:type="dxa" w:w="1728"/>
+          </w:tcPr>
+          <w:p>
+            <w:r>
+              <w:t>Role</w:t>
+            </w:r>
+          </w:p>
+        </w:tc>
+        <w:tc>
+          <w:tcPr>
+            <w:tcW w:type="dxa" w:w="1728"/>
+          </w:tcPr>
+          <w:p>
+            <w:r>
+              <w:t>Base</w:t>
+            </w:r>
+          </w:p>
+        </w:tc>
+        <w:tc>
+          <w:tcPr>
+            <w:tcW w:type="dxa" w:w="1728"/>
+          </w:tcPr>
+          <w:p>
+            <w:r>
+              <w:t>OTE</w:t>
+            </w:r>
+          </w:p>
+        </w:tc>
+        <w:tc>
+          <w:tcPr>
+            <w:tcW w:type="dxa" w:w="1728"/>
+          </w:tcPr>
+          <w:p>
+            <w:r>
+              <w:t>Split</w:t>
+            </w:r>
+          </w:p>
+        </w:tc>
+        <w:tc>
+          <w:tcPr>
+            <w:tcW w:type="dxa" w:w="1728"/>
+          </w:tcPr>
+          <w:p>
+            <w:r>
+              <w:t>Quota</w:t>
+            </w:r>
+          </w:p>
+        </w:tc>
+      </w:tr>
+      <w:tr>
+        <w:tc>
+          <w:tcPr>
+            <w:tcW w:type="dxa" w:w="1728"/>
+          </w:tcPr>
+          <w:p>
+            <w:r>
+              <w:t>SDR</w:t>
+            </w:r>
+          </w:p>
+        </w:tc>
+        <w:tc>
+          <w:tcPr>
+            <w:tcW w:type="dxa" w:w="1728"/>
+          </w:tcPr>
+          <w:p>
+            <w:r>
+              <w:t>68,000</w:t>
+            </w:r>
+          </w:p>
+        </w:tc>
+        <w:tc>
+          <w:tcPr>
+            <w:tcW w:type="dxa" w:w="1728"/>
+          </w:tcPr>
+          <w:p>
+            <w:r>
+              <w:t>95,000</w:t>
+            </w:r>
+          </w:p>
+        </w:tc>
+        <w:tc>
+          <w:tcPr>
+            <w:tcW w:type="dxa" w:w="1728"/>
+          </w:tcPr>
+          <w:p>
+            <w:r>
+              <w:t>72/28</w:t>
+            </w:r>
+          </w:p>
+        </w:tc>
+        <w:tc>
+          <w:tcPr>
+            <w:tcW w:type="dxa" w:w="1728"/>
+          </w:tcPr>
+          <w:p>
+            <w:r>
+              <w:t>meetings based</w:t>
+            </w:r>
+          </w:p>
+        </w:tc>
+      </w:tr>
+      <w:tr>
+        <w:tc>
+          <w:tcPr>
+            <w:tcW w:type="dxa" w:w="1728"/>
+          </w:tcPr>
+          <w:p>
+            <w:r>
+              <w:t>Mid Market AE</w:t>
+            </w:r>
+          </w:p>
+        </w:tc>
+        <w:tc>
+          <w:tcPr>
+            <w:tcW w:type="dxa" w:w="1728"/>
+          </w:tcPr>
+          <w:p>
+            <w:r>
+              <w:t>110,000</w:t>
+            </w:r>
+          </w:p>
+        </w:tc>
+        <w:tc>
+          <w:tcPr>
+            <w:tcW w:type="dxa" w:w="1728"/>
+          </w:tcPr>
+          <w:p>
+            <w:r>
+              <w:t>210,000</w:t>
+            </w:r>
+          </w:p>
+        </w:tc>
+        <w:tc>
+          <w:tcPr>
+            <w:tcW w:type="dxa" w:w="1728"/>
+          </w:tcPr>
+          <w:p>
+            <w:r>
+              <w:t>52/48</w:t>
+            </w:r>
+          </w:p>
+        </w:tc>
+        <w:tc>
+          <w:tcPr>
+            <w:tcW w:type="dxa" w:w="1728"/>
+          </w:tcPr>
+          <w:p>
+            <w:r>
+              <w:t>720,000</w:t>
+            </w:r>
+          </w:p>
+        </w:tc>
+      </w:tr>
+      <w:tr>
+        <w:tc>
+          <w:tcPr>
+            <w:tcW w:type="dxa" w:w="1728"/>
+          </w:tcPr>
+          <w:p>
+            <w:r>
+              <w:t>Enterprise AE</w:t>
+            </w:r>
+          </w:p>
+        </w:tc>
+        <w:tc>
+          <w:tcPr>
+            <w:tcW w:type="dxa" w:w="1728"/>
+          </w:tcPr>
+          <w:p>
+            <w:r>
+              <w:t>145,000</w:t>
+            </w:r>
+          </w:p>
+        </w:tc>
+        <w:tc>
+          <w:tcPr>
+            <w:tcW w:type="dxa" w:w="1728"/>
+          </w:tcPr>
+          <w:p>
+            <w:r>
+              <w:t>290,000</w:t>
+            </w:r>
+          </w:p>
+        </w:tc>
+        <w:tc>
+          <w:tcPr>
+            <w:tcW w:type="dxa" w:w="1728"/>
+          </w:tcPr>
+          <w:p>
+            <w:r>
+              <w:t>50/50</w:t>
+            </w:r>
+          </w:p>
+        </w:tc>
+        <w:tc>
+          <w:tcPr>
+            <w:tcW w:type="dxa" w:w="1728"/>
+          </w:tcPr>
+          <w:p>
+            <w:r>
+              <w:t>1,450,000</w:t>
+            </w:r>
+          </w:p>
+        </w:tc>
+      </w:tr>
+      <w:tr>
+        <w:tc>
+          <w:tcPr>
+            <w:tcW w:type="dxa" w:w="1728"/>
+          </w:tcPr>
+          <w:p>
+            <w:r>
+              <w:t>Sales Engineer</w:t>
+            </w:r>
+          </w:p>
+        </w:tc>
+        <w:tc>
+          <w:tcPr>
+            <w:tcW w:type="dxa" w:w="1728"/>
+          </w:tcPr>
+          <w:p>
+            <w:r>
+              <w:t>160,000</w:t>
+            </w:r>
+          </w:p>
+        </w:tc>
+        <w:tc>
+          <w:tcPr>
+            <w:tcW w:type="dxa" w:w="1728"/>
+          </w:tcPr>
+          <w:p>
+            <w:r>
+              <w:t>210,000</w:t>
+            </w:r>
+          </w:p>
+        </w:tc>
+        <w:tc>
+          <w:tcPr>
+            <w:tcW w:type="dxa" w:w="1728"/>
+          </w:tcPr>
+          <w:p>
+            <w:r>
+              <w:t>76/24</w:t>
+            </w:r>
+          </w:p>
+        </w:tc>
+        <w:tc>
+          <w:tcPr>
+            <w:tcW w:type="dxa" w:w="1728"/>
+          </w:tcPr>
+          <w:p>
+            <w:r>
+              <w:t>team quota</w:t>
+            </w:r>
+          </w:p>
+        </w:tc>
+      </w:tr>
+      <w:tr>
+        <w:tc>
+          <w:tcPr>
+            <w:tcW w:type="dxa" w:w="1728"/>
+          </w:tcPr>
+          <w:p>
+            <w:r>
+              <w:t>CSM</w:t>
+            </w:r>
+          </w:p>
+        </w:tc>
+        <w:tc>
+          <w:tcPr>
+            <w:tcW w:type="dxa" w:w="1728"/>
+          </w:tcPr>
+          <w:p>
+            <w:r>
+              <w:t>105,000</w:t>
+            </w:r>
+          </w:p>
+        </w:tc>
+        <w:tc>
+          <w:tcPr>
+            <w:tcW w:type="dxa" w:w="1728"/>
+          </w:tcPr>
+          <w:p>
+            <w:r>
+              <w:t>125,000</w:t>
+            </w:r>
+          </w:p>
+        </w:tc>
+        <w:tc>
+          <w:tcPr>
+            <w:tcW w:type="dxa" w:w="1728"/>
+          </w:tcPr>
+          <w:p>
+            <w:r>
+              <w:t>84/16</w:t>
+            </w:r>
+          </w:p>
+        </w:tc>
+        <w:tc>
+          <w:tcPr>
+            <w:tcW w:type="dxa" w:w="1728"/>
+          </w:tcPr>
+          <w:p>
+            <w:r>
+              <w:t>GRR target</w:t>
+            </w:r>
+          </w:p>
+        </w:tc>
+      </w:tr>
+    </w:tbl>
+    <w:p/>
+    <w:p>
+      <w:r>
+        <w:t>Equity refresh. Employees at L4 and above with at least 24 months of tenure are eligible for an annual refresh grant equal to 25 percent of their new hire grant if rated Meets, and 50 percent if rated Exceeds. Refresh grants vest monthly over four years with no cliff. The current 409A valuation is 6.12 dollars per share (August 2026).</w:t>
+      </w:r>
+    </w:p>
+    <w:p>
+      <w:r>
+        <w:t>Manager FAQ. Q: Can I tell a candidate the range? A: In states with pay transparency laws (CA, NY, WA, CO, IL and others) the posted range is the full band and you can reference it. Do not share the midpoint or the internal guideline of offering at 45 to 55 percent of range. Q: Someone found out a peer earns more. A: Route to your People Partner, do not discuss specific salaries. Q: Can I promise a promotion in the offer? A: No.</w:t>
+      </w:r>
+    </w:p>
+    <w:p>
+      <w:r>
+        <w:t>Open item for committee: whether to add a Tier 0 at 108 percent for Bay Area ML roles given Lantern hiring difficulty. People team recommends against, prefers one off sign on bonuses up to 60k for the three ML infra roles.</w:t>
+      </w:r>
+    </w:p>
+    <w:p>
       <w:r>
         <w:t>Offers outside band. Any offer above the band maximum requires approval from the VP of People and the CFO. Sign on bonuses are capped at 40,000 dollars for L5 and below. Do not match competing offers from Quillmark without consulting the People Team, as we are aware of a targeted recruiting campaign.</w:t>
       </w:r>
     </w:p>
-    <w:p>
-      <w:r>
-        <w:t>Document control and handling. This document is classified CONFIDENTIAL under the Calloway Metrics Information Classification Policy. It may be stored only in approved company systems and must not be uploaded, pasted or summarized in external services, including consumer AI assistants, translation sites or personal email. Printed copies must be shredded after use. Report suspected disclosure to the Security team within one hour of discovery.</w:t>
-      </w:r>
-    </w:p>
     <w:sectPr>
       <w:headerReference w:type="default" r:id="rId9"/>
+      <w:footerReference w:type="default" r:id="rId10"/>
       <w:pgSz w:w="12240" w:h="15840"/>
       <w:pgMar w:top="1440" w:right="1800" w:bottom="1440" w:left="1800" w:header="720" w:footer="720" w:gutter="0"/>
       <w:cols w:space="720"/>
@@ -135,6 +1260,19 @@
 </w:document>
 </file>
 
+<file path=word/footer1.xml><?xml version="1.0" encoding="utf-8"?>
+<w:ftr xmlns:m="http://schemas.openxmlformats.org/officeDocument/2006/math" xmlns:mc="http://schemas.openxmlformats.org/markup-compatibility/2006" xmlns:mo="http://schemas.microsoft.com/office/mac/office/2008/main" xmlns:mv="urn:schemas-microsoft-com:mac:vml" xmlns:o="urn:schemas-microsoft-com:office:office" xmlns:r="http://schemas.openxmlformats.org/officeDocument/2006/relationships" xmlns:v="urn:schemas-microsoft-com:vml" xmlns:w10="urn:schemas-microsoft-com:office:word" xmlns:w14="http://schemas.microsoft.com/office/word/2010/wordml" xmlns:w="http://schemas.openxmlformats.org/wordprocessingml/2006/main" xmlns:wne="http://schemas.microsoft.com/office/word/2006/wordml" xmlns:wp14="http://schemas.microsoft.com/office/word/2010/wordprocessingDrawing" xmlns:wp="http://schemas.openxmlformats.org/drawingml/2006/wordprocessingDrawing" xmlns:wpc="http://schemas.microsoft.com/office/word/2010/wordprocessingCanvas" xmlns:wpg="http://schemas.microsoft.com/office/word/2010/wordprocessingGroup" xmlns:wpi="http://schemas.microsoft.com/office/word/2010/wordprocessingInk" xmlns:wps="http://schemas.microsoft.com/office/word/2010/wordprocessingShape" mc:Ignorable="w14 wp14">
+  <w:p>
+    <w:pPr>
+      <w:pStyle w:val="Footer"/>
+    </w:pPr>
+    <w:r>
+      <w:t>HR Compensation Bands 2027 | v2.1 | Internal use only</w:t>
+    </w:r>
+  </w:p>
+</w:ftr>
+</file>
+
 <file path=word/header1.xml><?xml version="1.0" encoding="utf-8"?>
 <w:hdr xmlns:m="http://schemas.openxmlformats.org/officeDocument/2006/math" xmlns:mc="http://schemas.openxmlformats.org/markup-compatibility/2006" xmlns:mo="http://schemas.microsoft.com/office/mac/office/2008/main" xmlns:mv="urn:schemas-microsoft-com:mac:vml" xmlns:o="urn:schemas-microsoft-com:office:office" xmlns:r="http://schemas.openxmlformats.org/officeDocument/2006/relationships" xmlns:v="urn:schemas-microsoft-com:vml" xmlns:w10="urn:schemas-microsoft-com:office:word" xmlns:w14="http://schemas.microsoft.com/office/word/2010/wordml" xmlns:w="http://schemas.openxmlformats.org/wordprocessingml/2006/main" xmlns:wne="http://schemas.microsoft.com/office/word/2006/wordml" xmlns:wp14="http://schemas.microsoft.com/office/word/2010/wordprocessingDrawing" xmlns:wp="http://schemas.openxmlformats.org/drawingml/2006/wordprocessingDrawing" xmlns:wpc="http://schemas.microsoft.com/office/word/2010/wordprocessingCanvas" xmlns:wpg="http://schemas.microsoft.com/office/word/2010/wordprocessingGroup" xmlns:wpi="http://schemas.microsoft.com/office/word/2010/wordprocessingInk" xmlns:wps="http://schemas.microsoft.com/office/word/2010/wordprocessingShape" mc:Ignorable="w14 wp14">
   <w:p>
@@ -142,7 +1280,7 @@
       <w:pStyle w:val="Header"/>
     </w:pPr>
     <w:r>
-      <w:t>CONFIDENTIAL</w:t>
+      <w:t>CONFIDENTIAL - Calloway Metrics, Inc.</w:t>
     </w:r>
   </w:p>
 </w:hdr>
@@ -511,6 +1649,10 @@
     <w:name w:val="Normal"/>
     <w:qFormat/>
     <w:rsid w:val="00FC693F"/>
+    <w:rPr>
+      <w:rFonts w:ascii="Calibri" w:hAnsi="Calibri"/>
+      <w:sz w:val="21"/>
+    </w:rPr>
   </w:style>
   <w:style w:type="paragraph" w:styleId="Header">
     <w:name w:val="header"/>

</xml_diff>